<commit_message>
VLNCN: tich hop QD 2272/QD-UBND 29/6/2026 (SCT tiep nhan ho so GCN san xuat TCTN) + QD 1883/QD-UBND ban ky that; dong bo cheo 4 plugin; cap nhat mau 21
</commit_message>
<xml_diff>
--- a/sd-vlncn-sct-vn/skills/sd-vlncn-sct-vn/vi-du-thuc-te/CV-trien-khai-Luat-118-2025-VLNCN-du-thao-9.8.2026.docx
+++ b/sd-vlncn-sct-vn/skills/sd-vlncn-sct-vn/vi-du-thuc-te/CV-trien-khai-Luat-118-2025-VLNCN-du-thao-9.8.2026.docx
@@ -657,7 +657,7 @@
     </w:p>
     <w:p>
       <w:pPr>
-        <w:spacing w:before="40" w:line="360" w:lineRule="exact" w:after="40"/>
+        <w:spacing w:before="20" w:line="340" w:lineRule="exact" w:after="20"/>
         <w:ind w:firstLine="720"/>
         <w:jc w:val="both"/>
         <w:rPr>
@@ -754,7 +754,7 @@
     </w:p>
     <w:p>
       <w:pPr>
-        <w:spacing w:before="40" w:line="360" w:lineRule="exact" w:after="40"/>
+        <w:spacing w:before="20" w:line="340" w:lineRule="exact" w:after="20"/>
         <w:ind w:firstLine="720"/>
         <w:jc w:val="both"/>
         <w:rPr>
@@ -844,7 +844,7 @@
     </w:p>
     <w:p>
       <w:pPr>
-        <w:spacing w:before="40" w:line="360" w:lineRule="exact" w:after="40"/>
+        <w:spacing w:before="20" w:line="340" w:lineRule="exact" w:after="20"/>
         <w:ind w:firstLine="720"/>
         <w:jc w:val="both"/>
         <w:rPr>
@@ -910,7 +910,7 @@
     </w:p>
     <w:p>
       <w:pPr>
-        <w:spacing w:before="40" w:line="360" w:lineRule="exact" w:after="40"/>
+        <w:spacing w:before="20" w:line="340" w:lineRule="exact" w:after="20"/>
         <w:ind w:firstLine="720"/>
         <w:jc w:val="both"/>
         <w:rPr>
@@ -928,7 +928,7 @@
     </w:p>
     <w:p>
       <w:pPr>
-        <w:spacing w:before="40" w:line="360" w:lineRule="exact" w:after="40"/>
+        <w:spacing w:before="20" w:line="340" w:lineRule="exact" w:after="20"/>
         <w:ind w:firstLine="720"/>
         <w:jc w:val="both"/>
         <w:rPr>
@@ -1024,7 +1024,7 @@
     </w:p>
     <w:p>
       <w:pPr>
-        <w:spacing w:before="40" w:line="360" w:lineRule="exact" w:after="40"/>
+        <w:spacing w:before="20" w:line="340" w:lineRule="exact" w:after="20"/>
         <w:ind w:firstLine="720"/>
         <w:jc w:val="both"/>
         <w:rPr>
@@ -1037,7 +1037,7 @@
           <w:rFonts w:ascii="Times New Roman" w:hAnsi="Times New Roman"/>
           <w:szCs w:val="28"/>
         </w:rPr>
-        <w:t>4. Về tài liệu phòng cháy, chữa cháy trong hồ sơ đề nghị cấp Giấy phép sử dụng VLNCN: nộp bản sao văn bản nghiệm thu về phòng cháy và chữa cháy hoặc văn bản chấp thuận kết quả nghiệm thu về phòng cháy và chữa cháy đối với kho cố định chứa VLNCN và điều kiện bảo đảm an toàn theo tiêu chuẩn, quy chuẩn kỹ thuật (điểm đ khoản 1 Điều 39, được sửa đổi tại khoản 6 Điều 9 Luật số 118/2025/QH15).</w:t>
+        <w:t>4. Về tài liệu phòng cháy, chữa cháy trong hồ sơ đề nghị cấp Giấy phép sử dụng VLNCN: nộp bản sao văn bản nghiệm thu về phòng cháy và chữa cháy hoặc văn bản chấp thuận kết quả nghiệm thu về phòng cháy và chữa cháy đối với kho cố định chứa VLNCN và điều kiện bảo đảm an toàn theo tiêu chuẩn, quy chuẩn kỹ thuật theo quy định tại điểm đ khoản 1 Điều 39 (được sửa đổi tại khoản 6 Điều 9 Luật số 118/2025/QH15 nêu trên).</w:t>
       </w:r>
       <w:r>
         <w:rPr>
@@ -1078,7 +1078,7 @@
     </w:p>
     <w:p>
       <w:pPr>
-        <w:spacing w:before="40" w:line="360" w:lineRule="exact" w:after="40"/>
+        <w:spacing w:before="20" w:line="340" w:lineRule="exact" w:after="20"/>
         <w:ind w:firstLine="720"/>
         <w:jc w:val="both"/>
         <w:rPr>
@@ -1096,7 +1096,7 @@
     </w:p>
     <w:p>
       <w:pPr>
-        <w:spacing w:before="40" w:line="360" w:lineRule="exact" w:after="40"/>
+        <w:spacing w:before="20" w:line="340" w:lineRule="exact" w:after="20"/>
         <w:ind w:firstLine="720"/>
         <w:jc w:val="both"/>
         <w:rPr>
@@ -1109,7 +1109,7 @@
           <w:rFonts w:ascii="Times New Roman" w:hAnsi="Times New Roman"/>
           <w:szCs w:val="28"/>
         </w:rPr>
-        <w:t>6. Hồ sơ đề nghị cấp Giấy chứng nhận đủ điều kiện sản xuất TCTN được nộp trên Cổng dịch vụ công quốc gia, Hệ thống thông tin giải quyết thủ tục hành chính của UBND tỉnh nơi sản xuất TCTN hoặc gửi qua đường bưu chính đến cơ quan có thẩm quyền do UBND tỉnh quy định (khoản 5 Điều 44).</w:t>
+        <w:t>6. Hồ sơ đề nghị cấp, cấp lại, cấp điều chỉnh Giấy chứng nhận đủ điều kiện sản xuất TCTN được nộp trên Cổng dịch vụ công quốc gia, Hệ thống thông tin giải quyết thủ tục hành chính của UBND tỉnh hoặc gửi qua đường bưu chính đến Sở Công Thương tỉnh Lào Cai - cơ quan tiếp nhận hồ sơ theo Quyết định số 2272/QĐ-UBND ngày 29/6/2026 của UBND tỉnh (khoản 5 Điều 44 Luật Quản lý, sử dụng vũ khí, vật liệu nổ và công cụ hỗ trợ, được sửa đổi tại khoản 8 Điều 9 Luật số 118/2025/QH15).</w:t>
       </w:r>
       <w:r>
         <w:rPr>
@@ -1150,7 +1150,7 @@
     </w:p>
     <w:p>
       <w:pPr>
-        <w:spacing w:before="40" w:line="360" w:lineRule="exact" w:after="40"/>
+        <w:spacing w:before="20" w:line="340" w:lineRule="exact" w:after="20"/>
         <w:ind w:firstLine="720"/>
         <w:jc w:val="both"/>
         <w:rPr>
@@ -1198,7 +1198,7 @@
     </w:p>
     <w:p>
       <w:pPr>
-        <w:spacing w:before="40" w:line="360" w:lineRule="exact" w:after="40"/>
+        <w:spacing w:before="20" w:line="340" w:lineRule="exact" w:after="20"/>
         <w:ind w:firstLine="720"/>
         <w:jc w:val="both"/>
         <w:rPr>
@@ -1251,7 +1251,7 @@
     </w:p>
     <w:p>
       <w:pPr>
-        <w:spacing w:before="40" w:line="360" w:lineRule="exact" w:after="40"/>
+        <w:spacing w:before="20" w:line="340" w:lineRule="exact" w:after="20"/>
         <w:ind w:firstLine="720"/>
         <w:jc w:val="both"/>
         <w:rPr>
@@ -1266,7 +1266,7 @@
           <w:color w:val="000000"/>
           <w:szCs w:val="28"/>
         </w:rPr>
-        <w:t>Ngoài các nội dung trên, đề nghị các tổ chức, cá nhân, doanh nghiệp tiếp tục thực hiện các nội dung tại Văn bản số 193/UBND-KT ngày 10/01/2026 của UBND tỉnh Lào Cai, Văn bản số 301/SCT-CN ngày 20/01/2026 của Sở Công Thương và các quy định của pháp luật hiện hành.</w:t>
+        <w:t>Ngoài các nội dung trên, đề nghị các tổ chức, cá nhân, doanh nghiệp tiếp tục thực hiện các nội dung tại Văn bản số 193/UBND-KT ngày 10/01/2026 của UBND tỉnh Lào Cai, Văn bản số 301/SCT-CN ngày 20/01/2026 của Sở Công Thương và các quy định của pháp luật hiện hành. Trong quá trình thực hiện, nếu có khó khăn, vướng mắc, đề nghị phản ánh về Sở Công Thương để được xem xét, giải quyết theo thẩm quyền.</w:t>
       </w:r>
       <w:r>
         <w:rPr>
@@ -1383,25 +1383,7 @@
     </w:p>
     <w:p>
       <w:pPr>
-        <w:spacing w:before="40" w:line="360" w:lineRule="exact" w:after="40"/>
-        <w:ind w:firstLine="720"/>
-        <w:jc w:val="both"/>
-        <w:rPr>
-          <w:rFonts w:ascii="Times New Roman" w:hAnsi="Times New Roman"/>
-          <w:szCs w:val="28"/>
-        </w:rPr>
-      </w:pPr>
-      <w:r>
-        <w:rPr>
-          <w:rFonts w:ascii="Times New Roman" w:hAnsi="Times New Roman"/>
-          <w:szCs w:val="28"/>
-        </w:rPr>
-        <w:t>Trong quá trình thực hiện, nếu có khó khăn, vướng mắc, đề nghị phản ánh về Sở Công Thương để được xem xét, giải quyết theo thẩm quyền.</w:t>
-      </w:r>
-    </w:p>
-    <w:p>
-      <w:pPr>
-        <w:spacing w:before="40" w:line="360" w:lineRule="exact" w:after="40"/>
+        <w:spacing w:before="20" w:line="340" w:lineRule="exact" w:after="20"/>
         <w:ind w:firstLine="720"/>
         <w:jc w:val="both"/>
         <w:rPr>
@@ -1432,35 +1414,6 @@
           <w:lang w:val="vi-VN"/>
         </w:rPr>
       </w:pPr>
-    </w:p>
-    <w:p>
-      <w:pPr>
-        <w:tabs>
-          <w:tab w:val="left" w:pos="7296"/>
-        </w:tabs>
-        <w:jc w:val="both"/>
-        <w:rPr>
-          <w:rFonts w:ascii="Times New Roman" w:hAnsi="Times New Roman"/>
-          <w:sz w:val="14"/>
-          <w:szCs w:val="28"/>
-        </w:rPr>
-      </w:pPr>
-      <w:r>
-        <w:rPr>
-          <w:rFonts w:ascii="Times New Roman" w:hAnsi="Times New Roman"/>
-          <w:sz w:val="26"/>
-          <w:szCs w:val="28"/>
-        </w:rPr>
-        <w:t xml:space="preserve">                 </w:t>
-      </w:r>
-      <w:r>
-        <w:rPr>
-          <w:rFonts w:ascii="Times New Roman" w:hAnsi="Times New Roman"/>
-          <w:sz w:val="26"/>
-          <w:szCs w:val="28"/>
-        </w:rPr>
-        <w:t xml:space="preserve">                                                    </w:t>
-      </w:r>
     </w:p>
     <w:tbl>
       <w:tblPr>
@@ -1474,6 +1427,9 @@
         <w:gridCol w:w="4191"/>
       </w:tblGrid>
       <w:tr>
+        <w:trPr>
+          <w:cantSplit/>
+        </w:trPr>
         <w:tc>
           <w:tcPr>
             <w:tcW w:w="4740" w:type="dxa"/>
@@ -1814,7 +1770,6 @@
         </w:tc>
       </w:tr>
     </w:tbl>
-    <w:p/>
     <w:sectPr>
       <w:headerReference w:type="default" r:id="rId6"/>
       <w:pgSz w:w="11907" w:h="16840" w:code="9"/>

</xml_diff>